<commit_message>
Drop the Notion backfill ask for I14
Neal decided on 2026-08-17 that the empty Notion "CVP Waveform Alterations" page
is not being backfilled. I14 is the curriculum's treatment of right atrial and
CVP waveform interpretation, built from the v2022 RA module, and that is enough.

Removed from the issues document, so Gustavo is not asked to do it. His two
outstanding rewrites now have a clear answer rather than a question: the
transmural versus intravascular CVP/RAP passage is still wanted, the CVP waveform
section is not, because I14 already covers it. What would help there instead is a
review of I14 itself.

Also updated the I14 issue block, and closed the standing open item in file 01
that had asked for the Notion page to be built. Reclassified from a source defect
to a note, since an empty page we have decided not to fill is no longer a defect.

Co-Authored-By: Claude Opus 5 (1M context) <noreply@anthropic.com>
</commit_message>
<xml_diff>
--- a/Informed Build - Issues for Review.docx
+++ b/Informed Build - Issues for Review.docx
@@ -1564,12 +1564,12 @@
         <w:t>The full section on CVP waveform, measurement and alterations.</w:t>
       </w:r>
       <w:r>
-        <w:t xml:space="preserve"> **I14 is</w:t>
+        <w:t xml:space="preserve"> **This one</w:t>
       </w:r>
     </w:p>
     <w:p>
       <w:r>
-        <w:t xml:space="preserve">   now written and complete**, built from the v2022 RA module because the Notion "CVP Waveform Alterations" page is empty. So this is no longer a gap to fill from nothing. The useful version of the task has changed shape: review I14, and fill the empty Notion page from it so Notion stops being a hole in the source library.</w:t>
+        <w:t xml:space="preserve">   is no longer needed.** I14 is written and complete, built from the v2022 RA module, and it covers the normal waveform, how to measure, and the pathological series. The empty Notion page is not being backfilled. What would help instead is a review of I14 itself, which has its own issue block.</w:t>
       </w:r>
     </w:p>
     <w:p>
@@ -1577,10 +1577,7 @@
         <w:rPr>
           <w:b/>
         </w:rPr>
-        <w:t>What we need is a decision on which of those two is still worth his time</w:t>
-      </w:r>
-      <w:r>
-        <w:t>, given both have moved.</w:t>
+        <w:t>So the answer on the two rewrites is: the transmural passage is still wanted, the CVP waveform section is not.</w:t>
       </w:r>
     </w:p>
     <w:p>
@@ -2510,12 +2507,21 @@
         <w:ind w:left="432"/>
       </w:pPr>
       <w:r>
-        <w:t>The Notion "CVP Waveform Alterations" page is confirmed empty, title line only.</w:t>
+        <w:t>The Notion "CVP Waveform Alterations" page is empty, title line only, so the</w:t>
       </w:r>
     </w:p>
     <w:p>
       <w:r>
-        <w:t xml:space="preserve">  This is the page Gustavo offered to write. The module was built from the deck and is complete without it.</w:t>
+        <w:t xml:space="preserve">  module was built from the v2022 RA module instead and is complete without it. </w:t>
+      </w:r>
+      <w:r>
+        <w:rPr>
+          <w:b/>
+        </w:rPr>
+        <w:t>Decided 2026-08-17: the Notion page is not being backfilled.</w:t>
+      </w:r>
+      <w:r>
+        <w:t xml:space="preserve"> I14 is the curriculum's treatment of this material.</w:t>
       </w:r>
     </w:p>
     <w:p>

</xml_diff>